<commit_message>
Use the manual's exact report section titles and numbering; refresh Word files and ZIPs
Co-Authored-By: Claude Sonnet 5.5 <noreply@anthropic.com>
Claude-Session: https://claude.ai/code/session_01KcJHyy2jKy46ycvtB68eDk
</commit_message>
<xml_diff>
--- a/CS4-S01-Parallel-BFS/01_Common/CS4-S01_Integrated_Report.docx
+++ b/CS4-S01-Parallel-BFS/01_Common/CS4-S01_Integrated_Report.docx
@@ -63,7 +63,7 @@
         <w:pStyle w:val="Heading1"/>
       </w:pPr>
       <w:r>
-        <w:t>Abstract</w:t>
+        <w:t>2  Abstract</w:t>
       </w:r>
     </w:p>
     <w:p>
@@ -101,7 +101,7 @@
         <w:pStyle w:val="Heading1"/>
       </w:pPr>
       <w:r>
-        <w:t>1  Introduction and Literature Survey</w:t>
+        <w:t>3  Introduction (along with Literature Survey)</w:t>
       </w:r>
     </w:p>
     <w:p>
@@ -965,7 +965,7 @@
         <w:pStyle w:val="Heading1"/>
       </w:pPr>
       <w:r>
-        <w:t>2  Problem and Research Question</w:t>
+        <w:t>4  Problem and Research Question</w:t>
       </w:r>
     </w:p>
     <w:p>
@@ -1083,7 +1083,7 @@
         <w:pStyle w:val="Heading1"/>
       </w:pPr>
       <w:r>
-        <w:t>3  Methodology</w:t>
+        <w:t>6  Methodology</w:t>
       </w:r>
     </w:p>
     <w:p>
@@ -1091,7 +1091,7 @@
         <w:pStyle w:val="Heading2"/>
       </w:pPr>
       <w:r>
-        <w:t>3.1  Division of work and common conventions</w:t>
+        <w:t>6.1  Division of work and common conventions</w:t>
       </w:r>
     </w:p>
     <w:p>
@@ -1440,7 +1440,7 @@
         <w:pStyle w:val="Heading2"/>
       </w:pPr>
       <w:r>
-        <w:t>3.2  Sequential baseline (Student 1)</w:t>
+        <w:t>6.2  Sequential baseline (Student 1)</w:t>
       </w:r>
     </w:p>
     <w:p>
@@ -1452,7 +1452,7 @@
           <w:b w:val="0"/>
           <w:i w:val="0"/>
         </w:rPr>
-        <w:t>The baseline is the classic queue-based BFS described in Section 1, with an array used as the queue and an integer distance array initialised to −1. It was implemented and validated before any parallel code was written, as required by the manual.</w:t>
+        <w:t>The baseline is the classic queue-based BFS described in Section 3, with an array used as the queue and an integer distance array initialised to −1. It was implemented and validated before any parallel code was written, as required by the manual.</w:t>
       </w:r>
     </w:p>
     <w:p>
@@ -1460,7 +1460,7 @@
         <w:pStyle w:val="Heading2"/>
       </w:pPr>
       <w:r>
-        <w:t>3.3  Level-synchronous OpenMP BFS (Student 2)</w:t>
+        <w:t>6.3  Level-synchronous OpenMP BFS (Student 2)</w:t>
       </w:r>
     </w:p>
     <w:p>
@@ -1552,7 +1552,7 @@
         <w:pStyle w:val="Heading2"/>
       </w:pPr>
       <w:r>
-        <w:t>3.4  Experimental environment</w:t>
+        <w:t>6.4  Experimental environment</w:t>
       </w:r>
     </w:p>
     <w:p>
@@ -2024,7 +2024,7 @@
         <w:pStyle w:val="Heading2"/>
       </w:pPr>
       <w:r>
-        <w:t>3.5  Experiment design (experimental choices, not manual requirements)</w:t>
+        <w:t>6.5  Experiment design (experimental choices, not manual requirements)</w:t>
       </w:r>
     </w:p>
     <w:p>
@@ -2242,7 +2242,7 @@
         <w:pStyle w:val="Heading2"/>
       </w:pPr>
       <w:r>
-        <w:t>3.6  Metrics</w:t>
+        <w:t>6.6  Metrics</w:t>
       </w:r>
     </w:p>
     <w:p>
@@ -2661,7 +2661,7 @@
         <w:pStyle w:val="Heading2"/>
       </w:pPr>
       <w:r>
-        <w:t>3.7  Correctness testing and reproducibility</w:t>
+        <w:t>6.7  Correctness testing and reproducibility</w:t>
       </w:r>
     </w:p>
     <w:p>
@@ -2693,7 +2693,7 @@
         <w:pStyle w:val="Heading1"/>
       </w:pPr>
       <w:r>
-        <w:t>4  Results and Discussion</w:t>
+        <w:t>7  Results and Discussion</w:t>
       </w:r>
     </w:p>
     <w:p>
@@ -4421,7 +4421,7 @@
         <w:pStyle w:val="Heading2"/>
       </w:pPr>
       <w:r>
-        <w:t>4.1  Execution time and speedup</w:t>
+        <w:t>7.1  Execution time and speedup</w:t>
       </w:r>
     </w:p>
     <w:p>
@@ -4643,7 +4643,7 @@
         <w:pStyle w:val="Heading2"/>
       </w:pPr>
       <w:r>
-        <w:t>4.2  Effect of graph size and density</w:t>
+        <w:t>7.2  Effect of graph size and density</w:t>
       </w:r>
     </w:p>
     <w:p>
@@ -5919,7 +5919,7 @@
         <w:pStyle w:val="Heading2"/>
       </w:pPr>
       <w:r>
-        <w:t>4.3  Why the structures behave differently: synchronization and work per level</w:t>
+        <w:t>7.3  Why the structures behave differently: synchronization and work per level</w:t>
       </w:r>
     </w:p>
     <w:p>
@@ -5931,7 +5931,7 @@
           <w:b w:val="0"/>
           <w:i w:val="0"/>
         </w:rPr>
-        <w:t>The path has one vertex per level, so there is nothing to share, yet every level still executes the full set of steps of Section 3.3. We divide the median time of the largest path by its number of levels: the cost per level is 0.82 µs with one thread, 2.38 µs with two and 3.65 µs with four, compared with 7.8 ns per vertex in the sequential program. Even with one thread the parallel code pays for its loop set-up and barrier steps, and the cost per level grows with the number of threads; the likely reason is that more threads have to meet at each barrier, but we did not test this directly. In the instrumented runs (Figure 6) the merge phase takes 56% and the barrier wait 8% of the 4-thread time on the path; the remaining time presumably lies in the expand phase and in loop start-up, which we could not time separately.</w:t>
+        <w:t>The path has one vertex per level, so there is nothing to share, yet every level still executes the full set of steps of Section 6.3. We divide the median time of the largest path by its number of levels: the cost per level is 0.82 µs with one thread, 2.38 µs with two and 3.65 µs with four, compared with 7.8 ns per vertex in the sequential program. Even with one thread the parallel code pays for its loop set-up and barrier steps, and the cost per level grows with the number of threads; the likely reason is that more threads have to meet at each barrier, but we did not test this directly. In the instrumented runs (Figure 6) the merge phase takes 56% and the barrier wait 8% of the 4-thread time on the path; the remaining time presumably lies in the expand phase and in loop start-up, which we could not time separately.</w:t>
       </w:r>
     </w:p>
     <w:p>
@@ -5951,7 +5951,7 @@
         <w:pStyle w:val="Heading2"/>
       </w:pPr>
       <w:r>
-        <w:t>4.4  Hypotheses and comparison with the literature</w:t>
+        <w:t>7.4  Hypotheses and comparison with the literature</w:t>
       </w:r>
     </w:p>
     <w:p>
@@ -6053,7 +6053,7 @@
         <w:pStyle w:val="Heading1"/>
       </w:pPr>
       <w:r>
-        <w:t>5  Limitations and Threats to Validity</w:t>
+        <w:t>8  Limitations and Threats to Validity</w:t>
       </w:r>
     </w:p>
     <w:p>
@@ -6201,7 +6201,7 @@
         <w:pStyle w:val="Heading1"/>
       </w:pPr>
       <w:r>
-        <w:t>6  Conclusion and Future Work</w:t>
+        <w:t>9  Conclusion and Future Work</w:t>
       </w:r>
     </w:p>
     <w:p>
@@ -6340,7 +6340,7 @@
         <w:pStyle w:val="Heading1"/>
       </w:pPr>
       <w:r>
-        <w:t>7  References</w:t>
+        <w:t>10  References</w:t>
       </w:r>
     </w:p>
     <w:p>

</xml_diff>

<commit_message>
Extend both technical notes to 5 pages with additional data-driven analysis
New figures (baseline scaling, run variation, per-level cost), worked BFS trace, test-case table,
graph statistics, baseline-sensitivity table, Karp-Flatt analysis, full speedup/TEPS/overhead tables.
Audit extended to 496 table numbers; ZIP packages rebuilt.

Co-Authored-By: Claude Sonnet 5.5 <noreply@anthropic.com>
Claude-Session: https://claude.ai/code/session_01KcJHyy2jKy46ycvtB68eDk
</commit_message>
<xml_diff>
--- a/CS4-S01-Parallel-BFS/01_Common/CS4-S01_Integrated_Report.docx
+++ b/CS4-S01-Parallel-BFS/01_Common/CS4-S01_Integrated_Report.docx
@@ -247,6 +247,10 @@
         <w:gridCol w:w="2304"/>
       </w:tblGrid>
       <w:tr>
+        <w:trPr>
+          <w:tblHeader w:val="true"/>
+          <w:cantSplit/>
+        </w:trPr>
         <w:tc>
           <w:tcPr>
             <w:tcW w:type="dxa" w:w="792"/>
@@ -254,6 +258,7 @@
           </w:tcPr>
           <w:p>
             <w:pPr>
+              <w:keepNext/>
               <w:spacing w:after="0" w:line="240" w:lineRule="auto"/>
             </w:pPr>
             <w:r/>
@@ -273,6 +278,7 @@
           </w:tcPr>
           <w:p>
             <w:pPr>
+              <w:keepNext/>
               <w:spacing w:after="0" w:line="240" w:lineRule="auto"/>
             </w:pPr>
             <w:r/>
@@ -292,6 +298,7 @@
           </w:tcPr>
           <w:p>
             <w:pPr>
+              <w:keepNext/>
               <w:spacing w:after="0" w:line="240" w:lineRule="auto"/>
             </w:pPr>
             <w:r/>
@@ -311,6 +318,7 @@
           </w:tcPr>
           <w:p>
             <w:pPr>
+              <w:keepNext/>
               <w:spacing w:after="0" w:line="240" w:lineRule="auto"/>
             </w:pPr>
             <w:r/>
@@ -325,12 +333,16 @@
         </w:tc>
       </w:tr>
       <w:tr>
+        <w:trPr>
+          <w:cantSplit/>
+        </w:trPr>
         <w:tc>
           <w:tcPr>
             <w:tcW w:type="dxa" w:w="792"/>
           </w:tcPr>
           <w:p>
             <w:pPr>
+              <w:keepNext/>
               <w:spacing w:after="0" w:line="240" w:lineRule="auto"/>
             </w:pPr>
             <w:r/>
@@ -349,6 +361,7 @@
           </w:tcPr>
           <w:p>
             <w:pPr>
+              <w:keepNext/>
               <w:spacing w:after="0" w:line="240" w:lineRule="auto"/>
             </w:pPr>
             <w:r/>
@@ -367,6 +380,7 @@
           </w:tcPr>
           <w:p>
             <w:pPr>
+              <w:keepNext/>
               <w:spacing w:after="0" w:line="240" w:lineRule="auto"/>
             </w:pPr>
             <w:r/>
@@ -385,6 +399,7 @@
           </w:tcPr>
           <w:p>
             <w:pPr>
+              <w:keepNext/>
               <w:spacing w:after="0" w:line="240" w:lineRule="auto"/>
             </w:pPr>
             <w:r/>
@@ -399,12 +414,16 @@
         </w:tc>
       </w:tr>
       <w:tr>
+        <w:trPr>
+          <w:cantSplit/>
+        </w:trPr>
         <w:tc>
           <w:tcPr>
             <w:tcW w:type="dxa" w:w="792"/>
           </w:tcPr>
           <w:p>
             <w:pPr>
+              <w:keepNext/>
               <w:spacing w:after="0" w:line="240" w:lineRule="auto"/>
             </w:pPr>
             <w:r/>
@@ -423,6 +442,7 @@
           </w:tcPr>
           <w:p>
             <w:pPr>
+              <w:keepNext/>
               <w:spacing w:after="0" w:line="240" w:lineRule="auto"/>
             </w:pPr>
             <w:r/>
@@ -441,6 +461,7 @@
           </w:tcPr>
           <w:p>
             <w:pPr>
+              <w:keepNext/>
               <w:spacing w:after="0" w:line="240" w:lineRule="auto"/>
             </w:pPr>
             <w:r/>
@@ -459,6 +480,7 @@
           </w:tcPr>
           <w:p>
             <w:pPr>
+              <w:keepNext/>
               <w:spacing w:after="0" w:line="240" w:lineRule="auto"/>
             </w:pPr>
             <w:r/>
@@ -473,12 +495,16 @@
         </w:tc>
       </w:tr>
       <w:tr>
+        <w:trPr>
+          <w:cantSplit/>
+        </w:trPr>
         <w:tc>
           <w:tcPr>
             <w:tcW w:type="dxa" w:w="792"/>
           </w:tcPr>
           <w:p>
             <w:pPr>
+              <w:keepNext/>
               <w:spacing w:after="0" w:line="240" w:lineRule="auto"/>
             </w:pPr>
             <w:r/>
@@ -497,6 +523,7 @@
           </w:tcPr>
           <w:p>
             <w:pPr>
+              <w:keepNext/>
               <w:spacing w:after="0" w:line="240" w:lineRule="auto"/>
             </w:pPr>
             <w:r/>
@@ -515,6 +542,7 @@
           </w:tcPr>
           <w:p>
             <w:pPr>
+              <w:keepNext/>
               <w:spacing w:after="0" w:line="240" w:lineRule="auto"/>
             </w:pPr>
             <w:r/>
@@ -533,6 +561,7 @@
           </w:tcPr>
           <w:p>
             <w:pPr>
+              <w:keepNext/>
               <w:spacing w:after="0" w:line="240" w:lineRule="auto"/>
             </w:pPr>
             <w:r/>
@@ -547,12 +576,16 @@
         </w:tc>
       </w:tr>
       <w:tr>
+        <w:trPr>
+          <w:cantSplit/>
+        </w:trPr>
         <w:tc>
           <w:tcPr>
             <w:tcW w:type="dxa" w:w="792"/>
           </w:tcPr>
           <w:p>
             <w:pPr>
+              <w:keepNext/>
               <w:spacing w:after="0" w:line="240" w:lineRule="auto"/>
             </w:pPr>
             <w:r/>
@@ -571,6 +604,7 @@
           </w:tcPr>
           <w:p>
             <w:pPr>
+              <w:keepNext/>
               <w:spacing w:after="0" w:line="240" w:lineRule="auto"/>
             </w:pPr>
             <w:r/>
@@ -589,6 +623,7 @@
           </w:tcPr>
           <w:p>
             <w:pPr>
+              <w:keepNext/>
               <w:spacing w:after="0" w:line="240" w:lineRule="auto"/>
             </w:pPr>
             <w:r/>
@@ -607,6 +642,7 @@
           </w:tcPr>
           <w:p>
             <w:pPr>
+              <w:keepNext/>
               <w:spacing w:after="0" w:line="240" w:lineRule="auto"/>
             </w:pPr>
             <w:r/>
@@ -621,12 +657,16 @@
         </w:tc>
       </w:tr>
       <w:tr>
+        <w:trPr>
+          <w:cantSplit/>
+        </w:trPr>
         <w:tc>
           <w:tcPr>
             <w:tcW w:type="dxa" w:w="792"/>
           </w:tcPr>
           <w:p>
             <w:pPr>
+              <w:keepNext/>
               <w:spacing w:after="0" w:line="240" w:lineRule="auto"/>
             </w:pPr>
             <w:r/>
@@ -645,6 +685,7 @@
           </w:tcPr>
           <w:p>
             <w:pPr>
+              <w:keepNext/>
               <w:spacing w:after="0" w:line="240" w:lineRule="auto"/>
             </w:pPr>
             <w:r/>
@@ -663,6 +704,7 @@
           </w:tcPr>
           <w:p>
             <w:pPr>
+              <w:keepNext/>
               <w:spacing w:after="0" w:line="240" w:lineRule="auto"/>
             </w:pPr>
             <w:r/>
@@ -681,6 +723,7 @@
           </w:tcPr>
           <w:p>
             <w:pPr>
+              <w:keepNext/>
               <w:spacing w:after="0" w:line="240" w:lineRule="auto"/>
             </w:pPr>
             <w:r/>
@@ -695,12 +738,16 @@
         </w:tc>
       </w:tr>
       <w:tr>
+        <w:trPr>
+          <w:cantSplit/>
+        </w:trPr>
         <w:tc>
           <w:tcPr>
             <w:tcW w:type="dxa" w:w="792"/>
           </w:tcPr>
           <w:p>
             <w:pPr>
+              <w:keepNext/>
               <w:spacing w:after="0" w:line="240" w:lineRule="auto"/>
             </w:pPr>
             <w:r/>
@@ -719,6 +766,7 @@
           </w:tcPr>
           <w:p>
             <w:pPr>
+              <w:keepNext/>
               <w:spacing w:after="0" w:line="240" w:lineRule="auto"/>
             </w:pPr>
             <w:r/>
@@ -737,6 +785,7 @@
           </w:tcPr>
           <w:p>
             <w:pPr>
+              <w:keepNext/>
               <w:spacing w:after="0" w:line="240" w:lineRule="auto"/>
             </w:pPr>
             <w:r/>
@@ -755,6 +804,7 @@
           </w:tcPr>
           <w:p>
             <w:pPr>
+              <w:keepNext/>
               <w:spacing w:after="0" w:line="240" w:lineRule="auto"/>
             </w:pPr>
             <w:r/>
@@ -769,12 +819,16 @@
         </w:tc>
       </w:tr>
       <w:tr>
+        <w:trPr>
+          <w:cantSplit/>
+        </w:trPr>
         <w:tc>
           <w:tcPr>
             <w:tcW w:type="dxa" w:w="792"/>
           </w:tcPr>
           <w:p>
             <w:pPr>
+              <w:keepNext/>
               <w:spacing w:after="0" w:line="240" w:lineRule="auto"/>
             </w:pPr>
             <w:r/>
@@ -793,6 +847,7 @@
           </w:tcPr>
           <w:p>
             <w:pPr>
+              <w:keepNext/>
               <w:spacing w:after="0" w:line="240" w:lineRule="auto"/>
             </w:pPr>
             <w:r/>
@@ -811,6 +866,7 @@
           </w:tcPr>
           <w:p>
             <w:pPr>
+              <w:keepNext/>
               <w:spacing w:after="0" w:line="240" w:lineRule="auto"/>
             </w:pPr>
             <w:r/>
@@ -829,6 +885,7 @@
           </w:tcPr>
           <w:p>
             <w:pPr>
+              <w:keepNext/>
               <w:spacing w:after="0" w:line="240" w:lineRule="auto"/>
             </w:pPr>
             <w:r/>
@@ -843,6 +900,9 @@
         </w:tc>
       </w:tr>
       <w:tr>
+        <w:trPr>
+          <w:cantSplit/>
+        </w:trPr>
         <w:tc>
           <w:tcPr>
             <w:tcW w:type="dxa" w:w="792"/>
@@ -1123,6 +1183,10 @@
         <w:gridCol w:w="2448"/>
       </w:tblGrid>
       <w:tr>
+        <w:trPr>
+          <w:tblHeader w:val="true"/>
+          <w:cantSplit/>
+        </w:trPr>
         <w:tc>
           <w:tcPr>
             <w:tcW w:type="dxa" w:w="1152"/>
@@ -1130,6 +1194,7 @@
           </w:tcPr>
           <w:p>
             <w:pPr>
+              <w:keepNext/>
               <w:spacing w:after="0" w:line="240" w:lineRule="auto"/>
             </w:pPr>
             <w:r/>
@@ -1148,6 +1213,7 @@
           </w:tcPr>
           <w:p>
             <w:pPr>
+              <w:keepNext/>
               <w:spacing w:after="0" w:line="240" w:lineRule="auto"/>
             </w:pPr>
             <w:r/>
@@ -1167,6 +1233,7 @@
           </w:tcPr>
           <w:p>
             <w:pPr>
+              <w:keepNext/>
               <w:spacing w:after="0" w:line="240" w:lineRule="auto"/>
             </w:pPr>
             <w:r/>
@@ -1186,6 +1253,7 @@
           </w:tcPr>
           <w:p>
             <w:pPr>
+              <w:keepNext/>
               <w:spacing w:after="0" w:line="240" w:lineRule="auto"/>
             </w:pPr>
             <w:r/>
@@ -1200,12 +1268,16 @@
         </w:tc>
       </w:tr>
       <w:tr>
+        <w:trPr>
+          <w:cantSplit/>
+        </w:trPr>
         <w:tc>
           <w:tcPr>
             <w:tcW w:type="dxa" w:w="1152"/>
           </w:tcPr>
           <w:p>
             <w:pPr>
+              <w:keepNext/>
               <w:spacing w:after="0" w:line="240" w:lineRule="auto"/>
             </w:pPr>
             <w:r/>
@@ -1224,6 +1296,7 @@
           </w:tcPr>
           <w:p>
             <w:pPr>
+              <w:keepNext/>
               <w:spacing w:after="0" w:line="240" w:lineRule="auto"/>
             </w:pPr>
             <w:r/>
@@ -1242,6 +1315,7 @@
           </w:tcPr>
           <w:p>
             <w:pPr>
+              <w:keepNext/>
               <w:spacing w:after="0" w:line="240" w:lineRule="auto"/>
             </w:pPr>
             <w:r/>
@@ -1260,6 +1334,7 @@
           </w:tcPr>
           <w:p>
             <w:pPr>
+              <w:keepNext/>
               <w:spacing w:after="0" w:line="240" w:lineRule="auto"/>
             </w:pPr>
             <w:r/>
@@ -1274,6 +1349,9 @@
         </w:tc>
       </w:tr>
       <w:tr>
+        <w:trPr>
+          <w:cantSplit/>
+        </w:trPr>
         <w:tc>
           <w:tcPr>
             <w:tcW w:type="dxa" w:w="1152"/>
@@ -1582,6 +1660,10 @@
         <w:gridCol w:w="7056"/>
       </w:tblGrid>
       <w:tr>
+        <w:trPr>
+          <w:tblHeader w:val="true"/>
+          <w:cantSplit/>
+        </w:trPr>
         <w:tc>
           <w:tcPr>
             <w:tcW w:type="dxa" w:w="2304"/>
@@ -1589,6 +1671,7 @@
           </w:tcPr>
           <w:p>
             <w:pPr>
+              <w:keepNext/>
               <w:spacing w:after="0" w:line="240" w:lineRule="auto"/>
             </w:pPr>
             <w:r/>
@@ -1608,6 +1691,7 @@
           </w:tcPr>
           <w:p>
             <w:pPr>
+              <w:keepNext/>
               <w:spacing w:after="0" w:line="240" w:lineRule="auto"/>
             </w:pPr>
             <w:r/>
@@ -1622,12 +1706,16 @@
         </w:tc>
       </w:tr>
       <w:tr>
+        <w:trPr>
+          <w:cantSplit/>
+        </w:trPr>
         <w:tc>
           <w:tcPr>
             <w:tcW w:type="dxa" w:w="2304"/>
           </w:tcPr>
           <w:p>
             <w:pPr>
+              <w:keepNext/>
               <w:spacing w:after="0" w:line="240" w:lineRule="auto"/>
             </w:pPr>
             <w:r/>
@@ -1646,6 +1734,7 @@
           </w:tcPr>
           <w:p>
             <w:pPr>
+              <w:keepNext/>
               <w:spacing w:after="0" w:line="240" w:lineRule="auto"/>
             </w:pPr>
             <w:r/>
@@ -1660,12 +1749,16 @@
         </w:tc>
       </w:tr>
       <w:tr>
+        <w:trPr>
+          <w:cantSplit/>
+        </w:trPr>
         <w:tc>
           <w:tcPr>
             <w:tcW w:type="dxa" w:w="2304"/>
           </w:tcPr>
           <w:p>
             <w:pPr>
+              <w:keepNext/>
               <w:spacing w:after="0" w:line="240" w:lineRule="auto"/>
             </w:pPr>
             <w:r/>
@@ -1684,6 +1777,7 @@
           </w:tcPr>
           <w:p>
             <w:pPr>
+              <w:keepNext/>
               <w:spacing w:after="0" w:line="240" w:lineRule="auto"/>
             </w:pPr>
             <w:r/>
@@ -1698,12 +1792,16 @@
         </w:tc>
       </w:tr>
       <w:tr>
+        <w:trPr>
+          <w:cantSplit/>
+        </w:trPr>
         <w:tc>
           <w:tcPr>
             <w:tcW w:type="dxa" w:w="2304"/>
           </w:tcPr>
           <w:p>
             <w:pPr>
+              <w:keepNext/>
               <w:spacing w:after="0" w:line="240" w:lineRule="auto"/>
             </w:pPr>
             <w:r/>
@@ -1722,6 +1820,7 @@
           </w:tcPr>
           <w:p>
             <w:pPr>
+              <w:keepNext/>
               <w:spacing w:after="0" w:line="240" w:lineRule="auto"/>
             </w:pPr>
             <w:r/>
@@ -1736,12 +1835,16 @@
         </w:tc>
       </w:tr>
       <w:tr>
+        <w:trPr>
+          <w:cantSplit/>
+        </w:trPr>
         <w:tc>
           <w:tcPr>
             <w:tcW w:type="dxa" w:w="2304"/>
           </w:tcPr>
           <w:p>
             <w:pPr>
+              <w:keepNext/>
               <w:spacing w:after="0" w:line="240" w:lineRule="auto"/>
             </w:pPr>
             <w:r/>
@@ -1760,6 +1863,7 @@
           </w:tcPr>
           <w:p>
             <w:pPr>
+              <w:keepNext/>
               <w:spacing w:after="0" w:line="240" w:lineRule="auto"/>
             </w:pPr>
             <w:r/>
@@ -1774,12 +1878,16 @@
         </w:tc>
       </w:tr>
       <w:tr>
+        <w:trPr>
+          <w:cantSplit/>
+        </w:trPr>
         <w:tc>
           <w:tcPr>
             <w:tcW w:type="dxa" w:w="2304"/>
           </w:tcPr>
           <w:p>
             <w:pPr>
+              <w:keepNext/>
               <w:spacing w:after="0" w:line="240" w:lineRule="auto"/>
             </w:pPr>
             <w:r/>
@@ -1798,6 +1906,7 @@
           </w:tcPr>
           <w:p>
             <w:pPr>
+              <w:keepNext/>
               <w:spacing w:after="0" w:line="240" w:lineRule="auto"/>
             </w:pPr>
             <w:r/>
@@ -1812,12 +1921,16 @@
         </w:tc>
       </w:tr>
       <w:tr>
+        <w:trPr>
+          <w:cantSplit/>
+        </w:trPr>
         <w:tc>
           <w:tcPr>
             <w:tcW w:type="dxa" w:w="2304"/>
           </w:tcPr>
           <w:p>
             <w:pPr>
+              <w:keepNext/>
               <w:spacing w:after="0" w:line="240" w:lineRule="auto"/>
             </w:pPr>
             <w:r/>
@@ -1836,6 +1949,7 @@
           </w:tcPr>
           <w:p>
             <w:pPr>
+              <w:keepNext/>
               <w:spacing w:after="0" w:line="240" w:lineRule="auto"/>
             </w:pPr>
             <w:r/>
@@ -1850,12 +1964,16 @@
         </w:tc>
       </w:tr>
       <w:tr>
+        <w:trPr>
+          <w:cantSplit/>
+        </w:trPr>
         <w:tc>
           <w:tcPr>
             <w:tcW w:type="dxa" w:w="2304"/>
           </w:tcPr>
           <w:p>
             <w:pPr>
+              <w:keepNext/>
               <w:spacing w:after="0" w:line="240" w:lineRule="auto"/>
             </w:pPr>
             <w:r/>
@@ -1874,6 +1992,7 @@
           </w:tcPr>
           <w:p>
             <w:pPr>
+              <w:keepNext/>
               <w:spacing w:after="0" w:line="240" w:lineRule="auto"/>
             </w:pPr>
             <w:r/>
@@ -1888,12 +2007,16 @@
         </w:tc>
       </w:tr>
       <w:tr>
+        <w:trPr>
+          <w:cantSplit/>
+        </w:trPr>
         <w:tc>
           <w:tcPr>
             <w:tcW w:type="dxa" w:w="2304"/>
           </w:tcPr>
           <w:p>
             <w:pPr>
+              <w:keepNext/>
               <w:spacing w:after="0" w:line="240" w:lineRule="auto"/>
             </w:pPr>
             <w:r/>
@@ -1912,6 +2035,7 @@
           </w:tcPr>
           <w:p>
             <w:pPr>
+              <w:keepNext/>
               <w:spacing w:after="0" w:line="240" w:lineRule="auto"/>
             </w:pPr>
             <w:r/>
@@ -1926,12 +2050,16 @@
         </w:tc>
       </w:tr>
       <w:tr>
+        <w:trPr>
+          <w:cantSplit/>
+        </w:trPr>
         <w:tc>
           <w:tcPr>
             <w:tcW w:type="dxa" w:w="2304"/>
           </w:tcPr>
           <w:p>
             <w:pPr>
+              <w:keepNext/>
               <w:spacing w:after="0" w:line="240" w:lineRule="auto"/>
             </w:pPr>
             <w:r/>
@@ -1950,6 +2078,7 @@
           </w:tcPr>
           <w:p>
             <w:pPr>
+              <w:keepNext/>
               <w:spacing w:after="0" w:line="240" w:lineRule="auto"/>
             </w:pPr>
             <w:r/>
@@ -1964,6 +2093,9 @@
         </w:tc>
       </w:tr>
       <w:tr>
+        <w:trPr>
+          <w:cantSplit/>
+        </w:trPr>
         <w:tc>
           <w:tcPr>
             <w:tcW w:type="dxa" w:w="2304"/>
@@ -2744,6 +2876,10 @@
         <w:gridCol w:w="864"/>
       </w:tblGrid>
       <w:tr>
+        <w:trPr>
+          <w:tblHeader w:val="true"/>
+          <w:cantSplit/>
+        </w:trPr>
         <w:tc>
           <w:tcPr>
             <w:tcW w:type="dxa" w:w="1224"/>
@@ -2751,6 +2887,7 @@
           </w:tcPr>
           <w:p>
             <w:pPr>
+              <w:keepNext/>
               <w:spacing w:after="0" w:line="240" w:lineRule="auto"/>
             </w:pPr>
             <w:r/>
@@ -2770,6 +2907,7 @@
           </w:tcPr>
           <w:p>
             <w:pPr>
+              <w:keepNext/>
               <w:spacing w:after="0" w:line="240" w:lineRule="auto"/>
             </w:pPr>
             <w:r/>
@@ -2789,6 +2927,7 @@
           </w:tcPr>
           <w:p>
             <w:pPr>
+              <w:keepNext/>
               <w:spacing w:after="0" w:line="240" w:lineRule="auto"/>
             </w:pPr>
             <w:r/>
@@ -2808,6 +2947,7 @@
           </w:tcPr>
           <w:p>
             <w:pPr>
+              <w:keepNext/>
               <w:spacing w:after="0" w:line="240" w:lineRule="auto"/>
             </w:pPr>
             <w:r/>
@@ -2827,6 +2967,7 @@
           </w:tcPr>
           <w:p>
             <w:pPr>
+              <w:keepNext/>
               <w:spacing w:after="0" w:line="240" w:lineRule="auto"/>
             </w:pPr>
             <w:r/>
@@ -2846,6 +2987,7 @@
           </w:tcPr>
           <w:p>
             <w:pPr>
+              <w:keepNext/>
               <w:spacing w:after="0" w:line="240" w:lineRule="auto"/>
             </w:pPr>
             <w:r/>
@@ -2865,6 +3007,7 @@
           </w:tcPr>
           <w:p>
             <w:pPr>
+              <w:keepNext/>
               <w:spacing w:after="0" w:line="240" w:lineRule="auto"/>
             </w:pPr>
             <w:r/>
@@ -2886,6 +3029,7 @@
           </w:tcPr>
           <w:p>
             <w:pPr>
+              <w:keepNext/>
               <w:spacing w:after="0" w:line="240" w:lineRule="auto"/>
             </w:pPr>
             <w:r/>
@@ -2907,6 +3051,7 @@
           </w:tcPr>
           <w:p>
             <w:pPr>
+              <w:keepNext/>
               <w:spacing w:after="0" w:line="240" w:lineRule="auto"/>
             </w:pPr>
             <w:r/>
@@ -2928,6 +3073,7 @@
           </w:tcPr>
           <w:p>
             <w:pPr>
+              <w:keepNext/>
               <w:spacing w:after="0" w:line="240" w:lineRule="auto"/>
             </w:pPr>
             <w:r/>
@@ -2949,6 +3095,7 @@
           </w:tcPr>
           <w:p>
             <w:pPr>
+              <w:keepNext/>
               <w:spacing w:after="0" w:line="240" w:lineRule="auto"/>
             </w:pPr>
             <w:r/>
@@ -2965,12 +3112,16 @@
         </w:tc>
       </w:tr>
       <w:tr>
+        <w:trPr>
+          <w:cantSplit/>
+        </w:trPr>
         <w:tc>
           <w:tcPr>
             <w:tcW w:type="dxa" w:w="1224"/>
           </w:tcPr>
           <w:p>
             <w:pPr>
+              <w:keepNext/>
               <w:spacing w:after="0" w:line="240" w:lineRule="auto"/>
             </w:pPr>
             <w:r/>
@@ -2989,6 +3140,7 @@
           </w:tcPr>
           <w:p>
             <w:pPr>
+              <w:keepNext/>
               <w:spacing w:after="0" w:line="240" w:lineRule="auto"/>
             </w:pPr>
             <w:r/>
@@ -3007,6 +3159,7 @@
           </w:tcPr>
           <w:p>
             <w:pPr>
+              <w:keepNext/>
               <w:spacing w:after="0" w:line="240" w:lineRule="auto"/>
             </w:pPr>
             <w:r/>
@@ -3025,6 +3178,7 @@
           </w:tcPr>
           <w:p>
             <w:pPr>
+              <w:keepNext/>
               <w:spacing w:after="0" w:line="240" w:lineRule="auto"/>
             </w:pPr>
             <w:r/>
@@ -3043,6 +3197,7 @@
           </w:tcPr>
           <w:p>
             <w:pPr>
+              <w:keepNext/>
               <w:spacing w:after="0" w:line="240" w:lineRule="auto"/>
             </w:pPr>
             <w:r/>
@@ -3061,6 +3216,7 @@
           </w:tcPr>
           <w:p>
             <w:pPr>
+              <w:keepNext/>
               <w:spacing w:after="0" w:line="240" w:lineRule="auto"/>
             </w:pPr>
             <w:r/>
@@ -3079,6 +3235,7 @@
           </w:tcPr>
           <w:p>
             <w:pPr>
+              <w:keepNext/>
               <w:spacing w:after="0" w:line="240" w:lineRule="auto"/>
             </w:pPr>
             <w:r/>
@@ -3097,6 +3254,7 @@
           </w:tcPr>
           <w:p>
             <w:pPr>
+              <w:keepNext/>
               <w:spacing w:after="0" w:line="240" w:lineRule="auto"/>
             </w:pPr>
             <w:r/>
@@ -3115,6 +3273,7 @@
           </w:tcPr>
           <w:p>
             <w:pPr>
+              <w:keepNext/>
               <w:spacing w:after="0" w:line="240" w:lineRule="auto"/>
             </w:pPr>
             <w:r/>
@@ -3133,6 +3292,7 @@
           </w:tcPr>
           <w:p>
             <w:pPr>
+              <w:keepNext/>
               <w:spacing w:after="0" w:line="240" w:lineRule="auto"/>
             </w:pPr>
             <w:r/>
@@ -3151,6 +3311,7 @@
           </w:tcPr>
           <w:p>
             <w:pPr>
+              <w:keepNext/>
               <w:spacing w:after="0" w:line="240" w:lineRule="auto"/>
             </w:pPr>
             <w:r/>
@@ -3165,12 +3326,16 @@
         </w:tc>
       </w:tr>
       <w:tr>
+        <w:trPr>
+          <w:cantSplit/>
+        </w:trPr>
         <w:tc>
           <w:tcPr>
             <w:tcW w:type="dxa" w:w="1224"/>
           </w:tcPr>
           <w:p>
             <w:pPr>
+              <w:keepNext/>
               <w:spacing w:after="0" w:line="240" w:lineRule="auto"/>
             </w:pPr>
             <w:r/>
@@ -3189,6 +3354,7 @@
           </w:tcPr>
           <w:p>
             <w:pPr>
+              <w:keepNext/>
               <w:spacing w:after="0" w:line="240" w:lineRule="auto"/>
             </w:pPr>
             <w:r/>
@@ -3207,6 +3373,7 @@
           </w:tcPr>
           <w:p>
             <w:pPr>
+              <w:keepNext/>
               <w:spacing w:after="0" w:line="240" w:lineRule="auto"/>
             </w:pPr>
             <w:r/>
@@ -3225,6 +3392,7 @@
           </w:tcPr>
           <w:p>
             <w:pPr>
+              <w:keepNext/>
               <w:spacing w:after="0" w:line="240" w:lineRule="auto"/>
             </w:pPr>
             <w:r/>
@@ -3243,6 +3411,7 @@
           </w:tcPr>
           <w:p>
             <w:pPr>
+              <w:keepNext/>
               <w:spacing w:after="0" w:line="240" w:lineRule="auto"/>
             </w:pPr>
             <w:r/>
@@ -3261,6 +3430,7 @@
           </w:tcPr>
           <w:p>
             <w:pPr>
+              <w:keepNext/>
               <w:spacing w:after="0" w:line="240" w:lineRule="auto"/>
             </w:pPr>
             <w:r/>
@@ -3279,6 +3449,7 @@
           </w:tcPr>
           <w:p>
             <w:pPr>
+              <w:keepNext/>
               <w:spacing w:after="0" w:line="240" w:lineRule="auto"/>
             </w:pPr>
             <w:r/>
@@ -3297,6 +3468,7 @@
           </w:tcPr>
           <w:p>
             <w:pPr>
+              <w:keepNext/>
               <w:spacing w:after="0" w:line="240" w:lineRule="auto"/>
             </w:pPr>
             <w:r/>
@@ -3315,6 +3487,7 @@
           </w:tcPr>
           <w:p>
             <w:pPr>
+              <w:keepNext/>
               <w:spacing w:after="0" w:line="240" w:lineRule="auto"/>
             </w:pPr>
             <w:r/>
@@ -3333,6 +3506,7 @@
           </w:tcPr>
           <w:p>
             <w:pPr>
+              <w:keepNext/>
               <w:spacing w:after="0" w:line="240" w:lineRule="auto"/>
             </w:pPr>
             <w:r/>
@@ -3351,6 +3525,7 @@
           </w:tcPr>
           <w:p>
             <w:pPr>
+              <w:keepNext/>
               <w:spacing w:after="0" w:line="240" w:lineRule="auto"/>
             </w:pPr>
             <w:r/>
@@ -3365,12 +3540,16 @@
         </w:tc>
       </w:tr>
       <w:tr>
+        <w:trPr>
+          <w:cantSplit/>
+        </w:trPr>
         <w:tc>
           <w:tcPr>
             <w:tcW w:type="dxa" w:w="1224"/>
           </w:tcPr>
           <w:p>
             <w:pPr>
+              <w:keepNext/>
               <w:spacing w:after="0" w:line="240" w:lineRule="auto"/>
             </w:pPr>
             <w:r/>
@@ -3389,6 +3568,7 @@
           </w:tcPr>
           <w:p>
             <w:pPr>
+              <w:keepNext/>
               <w:spacing w:after="0" w:line="240" w:lineRule="auto"/>
             </w:pPr>
             <w:r/>
@@ -3407,6 +3587,7 @@
           </w:tcPr>
           <w:p>
             <w:pPr>
+              <w:keepNext/>
               <w:spacing w:after="0" w:line="240" w:lineRule="auto"/>
             </w:pPr>
             <w:r/>
@@ -3425,6 +3606,7 @@
           </w:tcPr>
           <w:p>
             <w:pPr>
+              <w:keepNext/>
               <w:spacing w:after="0" w:line="240" w:lineRule="auto"/>
             </w:pPr>
             <w:r/>
@@ -3443,6 +3625,7 @@
           </w:tcPr>
           <w:p>
             <w:pPr>
+              <w:keepNext/>
               <w:spacing w:after="0" w:line="240" w:lineRule="auto"/>
             </w:pPr>
             <w:r/>
@@ -3461,6 +3644,7 @@
           </w:tcPr>
           <w:p>
             <w:pPr>
+              <w:keepNext/>
               <w:spacing w:after="0" w:line="240" w:lineRule="auto"/>
             </w:pPr>
             <w:r/>
@@ -3479,6 +3663,7 @@
           </w:tcPr>
           <w:p>
             <w:pPr>
+              <w:keepNext/>
               <w:spacing w:after="0" w:line="240" w:lineRule="auto"/>
             </w:pPr>
             <w:r/>
@@ -3497,6 +3682,7 @@
           </w:tcPr>
           <w:p>
             <w:pPr>
+              <w:keepNext/>
               <w:spacing w:after="0" w:line="240" w:lineRule="auto"/>
             </w:pPr>
             <w:r/>
@@ -3515,6 +3701,7 @@
           </w:tcPr>
           <w:p>
             <w:pPr>
+              <w:keepNext/>
               <w:spacing w:after="0" w:line="240" w:lineRule="auto"/>
             </w:pPr>
             <w:r/>
@@ -3533,6 +3720,7 @@
           </w:tcPr>
           <w:p>
             <w:pPr>
+              <w:keepNext/>
               <w:spacing w:after="0" w:line="240" w:lineRule="auto"/>
             </w:pPr>
             <w:r/>
@@ -3551,6 +3739,7 @@
           </w:tcPr>
           <w:p>
             <w:pPr>
+              <w:keepNext/>
               <w:spacing w:after="0" w:line="240" w:lineRule="auto"/>
             </w:pPr>
             <w:r/>
@@ -3565,6 +3754,9 @@
         </w:tc>
       </w:tr>
       <w:tr>
+        <w:trPr>
+          <w:cantSplit/>
+        </w:trPr>
         <w:tc>
           <w:tcPr>
             <w:tcW w:type="dxa" w:w="1224"/>
@@ -3800,6 +3992,10 @@
         <w:gridCol w:w="1872"/>
       </w:tblGrid>
       <w:tr>
+        <w:trPr>
+          <w:tblHeader w:val="true"/>
+          <w:cantSplit/>
+        </w:trPr>
         <w:tc>
           <w:tcPr>
             <w:tcW w:type="dxa" w:w="1872"/>
@@ -3807,6 +4003,7 @@
           </w:tcPr>
           <w:p>
             <w:pPr>
+              <w:keepNext/>
               <w:spacing w:after="0" w:line="240" w:lineRule="auto"/>
             </w:pPr>
             <w:r/>
@@ -3826,6 +4023,7 @@
           </w:tcPr>
           <w:p>
             <w:pPr>
+              <w:keepNext/>
               <w:spacing w:after="0" w:line="240" w:lineRule="auto"/>
             </w:pPr>
             <w:r/>
@@ -3845,6 +4043,7 @@
           </w:tcPr>
           <w:p>
             <w:pPr>
+              <w:keepNext/>
               <w:spacing w:after="0" w:line="240" w:lineRule="auto"/>
             </w:pPr>
             <w:r/>
@@ -3864,6 +4063,7 @@
           </w:tcPr>
           <w:p>
             <w:pPr>
+              <w:keepNext/>
               <w:spacing w:after="0" w:line="240" w:lineRule="auto"/>
             </w:pPr>
             <w:r/>
@@ -3883,6 +4083,7 @@
           </w:tcPr>
           <w:p>
             <w:pPr>
+              <w:keepNext/>
               <w:spacing w:after="0" w:line="240" w:lineRule="auto"/>
             </w:pPr>
             <w:r/>
@@ -3897,12 +4098,16 @@
         </w:tc>
       </w:tr>
       <w:tr>
+        <w:trPr>
+          <w:cantSplit/>
+        </w:trPr>
         <w:tc>
           <w:tcPr>
             <w:tcW w:type="dxa" w:w="1872"/>
           </w:tcPr>
           <w:p>
             <w:pPr>
+              <w:keepNext/>
               <w:spacing w:after="0" w:line="240" w:lineRule="auto"/>
             </w:pPr>
             <w:r/>
@@ -3921,6 +4126,7 @@
           </w:tcPr>
           <w:p>
             <w:pPr>
+              <w:keepNext/>
               <w:spacing w:after="0" w:line="240" w:lineRule="auto"/>
             </w:pPr>
             <w:r/>
@@ -3939,6 +4145,7 @@
           </w:tcPr>
           <w:p>
             <w:pPr>
+              <w:keepNext/>
               <w:spacing w:after="0" w:line="240" w:lineRule="auto"/>
             </w:pPr>
             <w:r/>
@@ -3957,6 +4164,7 @@
           </w:tcPr>
           <w:p>
             <w:pPr>
+              <w:keepNext/>
               <w:spacing w:after="0" w:line="240" w:lineRule="auto"/>
             </w:pPr>
             <w:r/>
@@ -3975,6 +4183,7 @@
           </w:tcPr>
           <w:p>
             <w:pPr>
+              <w:keepNext/>
               <w:spacing w:after="0" w:line="240" w:lineRule="auto"/>
             </w:pPr>
             <w:r/>
@@ -3989,12 +4198,16 @@
         </w:tc>
       </w:tr>
       <w:tr>
+        <w:trPr>
+          <w:cantSplit/>
+        </w:trPr>
         <w:tc>
           <w:tcPr>
             <w:tcW w:type="dxa" w:w="1872"/>
           </w:tcPr>
           <w:p>
             <w:pPr>
+              <w:keepNext/>
               <w:spacing w:after="0" w:line="240" w:lineRule="auto"/>
             </w:pPr>
             <w:r/>
@@ -4013,6 +4226,7 @@
           </w:tcPr>
           <w:p>
             <w:pPr>
+              <w:keepNext/>
               <w:spacing w:after="0" w:line="240" w:lineRule="auto"/>
             </w:pPr>
             <w:r/>
@@ -4031,6 +4245,7 @@
           </w:tcPr>
           <w:p>
             <w:pPr>
+              <w:keepNext/>
               <w:spacing w:after="0" w:line="240" w:lineRule="auto"/>
             </w:pPr>
             <w:r/>
@@ -4049,6 +4264,7 @@
           </w:tcPr>
           <w:p>
             <w:pPr>
+              <w:keepNext/>
               <w:spacing w:after="0" w:line="240" w:lineRule="auto"/>
             </w:pPr>
             <w:r/>
@@ -4067,6 +4283,7 @@
           </w:tcPr>
           <w:p>
             <w:pPr>
+              <w:keepNext/>
               <w:spacing w:after="0" w:line="240" w:lineRule="auto"/>
             </w:pPr>
             <w:r/>
@@ -4081,12 +4298,16 @@
         </w:tc>
       </w:tr>
       <w:tr>
+        <w:trPr>
+          <w:cantSplit/>
+        </w:trPr>
         <w:tc>
           <w:tcPr>
             <w:tcW w:type="dxa" w:w="1872"/>
           </w:tcPr>
           <w:p>
             <w:pPr>
+              <w:keepNext/>
               <w:spacing w:after="0" w:line="240" w:lineRule="auto"/>
             </w:pPr>
             <w:r/>
@@ -4105,6 +4326,7 @@
           </w:tcPr>
           <w:p>
             <w:pPr>
+              <w:keepNext/>
               <w:spacing w:after="0" w:line="240" w:lineRule="auto"/>
             </w:pPr>
             <w:r/>
@@ -4123,6 +4345,7 @@
           </w:tcPr>
           <w:p>
             <w:pPr>
+              <w:keepNext/>
               <w:spacing w:after="0" w:line="240" w:lineRule="auto"/>
             </w:pPr>
             <w:r/>
@@ -4141,6 +4364,7 @@
           </w:tcPr>
           <w:p>
             <w:pPr>
+              <w:keepNext/>
               <w:spacing w:after="0" w:line="240" w:lineRule="auto"/>
             </w:pPr>
             <w:r/>
@@ -4159,6 +4383,7 @@
           </w:tcPr>
           <w:p>
             <w:pPr>
+              <w:keepNext/>
               <w:spacing w:after="0" w:line="240" w:lineRule="auto"/>
             </w:pPr>
             <w:r/>
@@ -4173,6 +4398,9 @@
         </w:tc>
       </w:tr>
       <w:tr>
+        <w:trPr>
+          <w:cantSplit/>
+        </w:trPr>
         <w:tc>
           <w:tcPr>
             <w:tcW w:type="dxa" w:w="1872"/>
@@ -4287,6 +4515,7 @@
           </w:tcPr>
           <w:p>
             <w:pPr>
+              <w:keepNext/>
               <w:jc w:val="center"/>
             </w:pPr>
             <w:r/>
@@ -4332,6 +4561,7 @@
           </w:tcPr>
           <w:p>
             <w:pPr>
+              <w:keepNext/>
               <w:jc w:val="center"/>
             </w:pPr>
             <w:r/>
@@ -4509,6 +4739,7 @@
           </w:tcPr>
           <w:p>
             <w:pPr>
+              <w:keepNext/>
               <w:jc w:val="center"/>
             </w:pPr>
             <w:r/>
@@ -4554,6 +4785,7 @@
           </w:tcPr>
           <w:p>
             <w:pPr>
+              <w:keepNext/>
               <w:jc w:val="center"/>
             </w:pPr>
             <w:r/>
@@ -4778,6 +5010,10 @@
         <w:gridCol w:w="1728"/>
       </w:tblGrid>
       <w:tr>
+        <w:trPr>
+          <w:tblHeader w:val="true"/>
+          <w:cantSplit/>
+        </w:trPr>
         <w:tc>
           <w:tcPr>
             <w:tcW w:type="dxa" w:w="1152"/>
@@ -4785,6 +5021,7 @@
           </w:tcPr>
           <w:p>
             <w:pPr>
+              <w:keepNext/>
               <w:spacing w:after="0" w:line="240" w:lineRule="auto"/>
             </w:pPr>
             <w:r/>
@@ -4804,6 +5041,7 @@
           </w:tcPr>
           <w:p>
             <w:pPr>
+              <w:keepNext/>
               <w:spacing w:after="0" w:line="240" w:lineRule="auto"/>
             </w:pPr>
             <w:r/>
@@ -4823,6 +5061,7 @@
           </w:tcPr>
           <w:p>
             <w:pPr>
+              <w:keepNext/>
               <w:spacing w:after="0" w:line="240" w:lineRule="auto"/>
             </w:pPr>
             <w:r/>
@@ -4842,6 +5081,7 @@
           </w:tcPr>
           <w:p>
             <w:pPr>
+              <w:keepNext/>
               <w:spacing w:after="0" w:line="240" w:lineRule="auto"/>
             </w:pPr>
             <w:r/>
@@ -4861,6 +5101,7 @@
           </w:tcPr>
           <w:p>
             <w:pPr>
+              <w:keepNext/>
               <w:spacing w:after="0" w:line="240" w:lineRule="auto"/>
             </w:pPr>
             <w:r/>
@@ -4880,6 +5121,7 @@
           </w:tcPr>
           <w:p>
             <w:pPr>
+              <w:keepNext/>
               <w:spacing w:after="0" w:line="240" w:lineRule="auto"/>
             </w:pPr>
             <w:r/>
@@ -4899,6 +5141,7 @@
           </w:tcPr>
           <w:p>
             <w:pPr>
+              <w:keepNext/>
               <w:spacing w:after="0" w:line="240" w:lineRule="auto"/>
             </w:pPr>
             <w:r/>
@@ -4913,12 +5156,16 @@
         </w:tc>
       </w:tr>
       <w:tr>
+        <w:trPr>
+          <w:cantSplit/>
+        </w:trPr>
         <w:tc>
           <w:tcPr>
             <w:tcW w:type="dxa" w:w="1152"/>
           </w:tcPr>
           <w:p>
             <w:pPr>
+              <w:keepNext/>
               <w:spacing w:after="0" w:line="240" w:lineRule="auto"/>
             </w:pPr>
             <w:r/>
@@ -4937,6 +5184,7 @@
           </w:tcPr>
           <w:p>
             <w:pPr>
+              <w:keepNext/>
               <w:spacing w:after="0" w:line="240" w:lineRule="auto"/>
             </w:pPr>
             <w:r/>
@@ -4955,6 +5203,7 @@
           </w:tcPr>
           <w:p>
             <w:pPr>
+              <w:keepNext/>
               <w:spacing w:after="0" w:line="240" w:lineRule="auto"/>
             </w:pPr>
             <w:r/>
@@ -4973,6 +5222,7 @@
           </w:tcPr>
           <w:p>
             <w:pPr>
+              <w:keepNext/>
               <w:spacing w:after="0" w:line="240" w:lineRule="auto"/>
             </w:pPr>
             <w:r/>
@@ -4991,6 +5241,7 @@
           </w:tcPr>
           <w:p>
             <w:pPr>
+              <w:keepNext/>
               <w:spacing w:after="0" w:line="240" w:lineRule="auto"/>
             </w:pPr>
             <w:r/>
@@ -5009,6 +5260,7 @@
           </w:tcPr>
           <w:p>
             <w:pPr>
+              <w:keepNext/>
               <w:spacing w:after="0" w:line="240" w:lineRule="auto"/>
             </w:pPr>
             <w:r/>
@@ -5027,6 +5279,7 @@
           </w:tcPr>
           <w:p>
             <w:pPr>
+              <w:keepNext/>
               <w:spacing w:after="0" w:line="240" w:lineRule="auto"/>
             </w:pPr>
             <w:r/>
@@ -5041,12 +5294,16 @@
         </w:tc>
       </w:tr>
       <w:tr>
+        <w:trPr>
+          <w:cantSplit/>
+        </w:trPr>
         <w:tc>
           <w:tcPr>
             <w:tcW w:type="dxa" w:w="1152"/>
           </w:tcPr>
           <w:p>
             <w:pPr>
+              <w:keepNext/>
               <w:spacing w:after="0" w:line="240" w:lineRule="auto"/>
             </w:pPr>
             <w:r/>
@@ -5065,6 +5322,7 @@
           </w:tcPr>
           <w:p>
             <w:pPr>
+              <w:keepNext/>
               <w:spacing w:after="0" w:line="240" w:lineRule="auto"/>
             </w:pPr>
             <w:r/>
@@ -5083,6 +5341,7 @@
           </w:tcPr>
           <w:p>
             <w:pPr>
+              <w:keepNext/>
               <w:spacing w:after="0" w:line="240" w:lineRule="auto"/>
             </w:pPr>
             <w:r/>
@@ -5101,6 +5360,7 @@
           </w:tcPr>
           <w:p>
             <w:pPr>
+              <w:keepNext/>
               <w:spacing w:after="0" w:line="240" w:lineRule="auto"/>
             </w:pPr>
             <w:r/>
@@ -5119,6 +5379,7 @@
           </w:tcPr>
           <w:p>
             <w:pPr>
+              <w:keepNext/>
               <w:spacing w:after="0" w:line="240" w:lineRule="auto"/>
             </w:pPr>
             <w:r/>
@@ -5137,6 +5398,7 @@
           </w:tcPr>
           <w:p>
             <w:pPr>
+              <w:keepNext/>
               <w:spacing w:after="0" w:line="240" w:lineRule="auto"/>
             </w:pPr>
             <w:r/>
@@ -5155,6 +5417,7 @@
           </w:tcPr>
           <w:p>
             <w:pPr>
+              <w:keepNext/>
               <w:spacing w:after="0" w:line="240" w:lineRule="auto"/>
             </w:pPr>
             <w:r/>
@@ -5169,12 +5432,16 @@
         </w:tc>
       </w:tr>
       <w:tr>
+        <w:trPr>
+          <w:cantSplit/>
+        </w:trPr>
         <w:tc>
           <w:tcPr>
             <w:tcW w:type="dxa" w:w="1152"/>
           </w:tcPr>
           <w:p>
             <w:pPr>
+              <w:keepNext/>
               <w:spacing w:after="0" w:line="240" w:lineRule="auto"/>
             </w:pPr>
             <w:r/>
@@ -5193,6 +5460,7 @@
           </w:tcPr>
           <w:p>
             <w:pPr>
+              <w:keepNext/>
               <w:spacing w:after="0" w:line="240" w:lineRule="auto"/>
             </w:pPr>
             <w:r/>
@@ -5211,6 +5479,7 @@
           </w:tcPr>
           <w:p>
             <w:pPr>
+              <w:keepNext/>
               <w:spacing w:after="0" w:line="240" w:lineRule="auto"/>
             </w:pPr>
             <w:r/>
@@ -5229,6 +5498,7 @@
           </w:tcPr>
           <w:p>
             <w:pPr>
+              <w:keepNext/>
               <w:spacing w:after="0" w:line="240" w:lineRule="auto"/>
             </w:pPr>
             <w:r/>
@@ -5247,6 +5517,7 @@
           </w:tcPr>
           <w:p>
             <w:pPr>
+              <w:keepNext/>
               <w:spacing w:after="0" w:line="240" w:lineRule="auto"/>
             </w:pPr>
             <w:r/>
@@ -5265,6 +5536,7 @@
           </w:tcPr>
           <w:p>
             <w:pPr>
+              <w:keepNext/>
               <w:spacing w:after="0" w:line="240" w:lineRule="auto"/>
             </w:pPr>
             <w:r/>
@@ -5283,6 +5555,7 @@
           </w:tcPr>
           <w:p>
             <w:pPr>
+              <w:keepNext/>
               <w:spacing w:after="0" w:line="240" w:lineRule="auto"/>
             </w:pPr>
             <w:r/>
@@ -5297,12 +5570,16 @@
         </w:tc>
       </w:tr>
       <w:tr>
+        <w:trPr>
+          <w:cantSplit/>
+        </w:trPr>
         <w:tc>
           <w:tcPr>
             <w:tcW w:type="dxa" w:w="1152"/>
           </w:tcPr>
           <w:p>
             <w:pPr>
+              <w:keepNext/>
               <w:spacing w:after="0" w:line="240" w:lineRule="auto"/>
             </w:pPr>
             <w:r/>
@@ -5321,6 +5598,7 @@
           </w:tcPr>
           <w:p>
             <w:pPr>
+              <w:keepNext/>
               <w:spacing w:after="0" w:line="240" w:lineRule="auto"/>
             </w:pPr>
             <w:r/>
@@ -5339,6 +5617,7 @@
           </w:tcPr>
           <w:p>
             <w:pPr>
+              <w:keepNext/>
               <w:spacing w:after="0" w:line="240" w:lineRule="auto"/>
             </w:pPr>
             <w:r/>
@@ -5357,6 +5636,7 @@
           </w:tcPr>
           <w:p>
             <w:pPr>
+              <w:keepNext/>
               <w:spacing w:after="0" w:line="240" w:lineRule="auto"/>
             </w:pPr>
             <w:r/>
@@ -5375,6 +5655,7 @@
           </w:tcPr>
           <w:p>
             <w:pPr>
+              <w:keepNext/>
               <w:spacing w:after="0" w:line="240" w:lineRule="auto"/>
             </w:pPr>
             <w:r/>
@@ -5393,6 +5674,7 @@
           </w:tcPr>
           <w:p>
             <w:pPr>
+              <w:keepNext/>
               <w:spacing w:after="0" w:line="240" w:lineRule="auto"/>
             </w:pPr>
             <w:r/>
@@ -5411,6 +5693,7 @@
           </w:tcPr>
           <w:p>
             <w:pPr>
+              <w:keepNext/>
               <w:spacing w:after="0" w:line="240" w:lineRule="auto"/>
             </w:pPr>
             <w:r/>
@@ -5425,12 +5708,16 @@
         </w:tc>
       </w:tr>
       <w:tr>
+        <w:trPr>
+          <w:cantSplit/>
+        </w:trPr>
         <w:tc>
           <w:tcPr>
             <w:tcW w:type="dxa" w:w="1152"/>
           </w:tcPr>
           <w:p>
             <w:pPr>
+              <w:keepNext/>
               <w:spacing w:after="0" w:line="240" w:lineRule="auto"/>
             </w:pPr>
             <w:r/>
@@ -5449,6 +5736,7 @@
           </w:tcPr>
           <w:p>
             <w:pPr>
+              <w:keepNext/>
               <w:spacing w:after="0" w:line="240" w:lineRule="auto"/>
             </w:pPr>
             <w:r/>
@@ -5467,6 +5755,7 @@
           </w:tcPr>
           <w:p>
             <w:pPr>
+              <w:keepNext/>
               <w:spacing w:after="0" w:line="240" w:lineRule="auto"/>
             </w:pPr>
             <w:r/>
@@ -5485,6 +5774,7 @@
           </w:tcPr>
           <w:p>
             <w:pPr>
+              <w:keepNext/>
               <w:spacing w:after="0" w:line="240" w:lineRule="auto"/>
             </w:pPr>
             <w:r/>
@@ -5503,6 +5793,7 @@
           </w:tcPr>
           <w:p>
             <w:pPr>
+              <w:keepNext/>
               <w:spacing w:after="0" w:line="240" w:lineRule="auto"/>
             </w:pPr>
             <w:r/>
@@ -5521,6 +5812,7 @@
           </w:tcPr>
           <w:p>
             <w:pPr>
+              <w:keepNext/>
               <w:spacing w:after="0" w:line="240" w:lineRule="auto"/>
             </w:pPr>
             <w:r/>
@@ -5539,6 +5831,7 @@
           </w:tcPr>
           <w:p>
             <w:pPr>
+              <w:keepNext/>
               <w:spacing w:after="0" w:line="240" w:lineRule="auto"/>
             </w:pPr>
             <w:r/>
@@ -5553,6 +5846,9 @@
         </w:tc>
       </w:tr>
       <w:tr>
+        <w:trPr>
+          <w:cantSplit/>
+        </w:trPr>
         <w:tc>
           <w:tcPr>
             <w:tcW w:type="dxa" w:w="1152"/>
@@ -5703,6 +5999,7 @@
           </w:tcPr>
           <w:p>
             <w:pPr>
+              <w:keepNext/>
               <w:jc w:val="center"/>
             </w:pPr>
             <w:r/>
@@ -5748,6 +6045,7 @@
           </w:tcPr>
           <w:p>
             <w:pPr>
+              <w:keepNext/>
               <w:jc w:val="center"/>
             </w:pPr>
             <w:r/>
@@ -5848,6 +6146,7 @@
           </w:tcPr>
           <w:p>
             <w:pPr>
+              <w:keepNext/>
               <w:jc w:val="center"/>
             </w:pPr>
             <w:r/>

</xml_diff>